<commit_message>
Added comment is file and new file html to word press how to
</commit_message>
<xml_diff>
--- a/documents/strategic_direction_and_roadmap/product_vision_qc.docx
+++ b/documents/strategic_direction_and_roadmap/product_vision_qc.docx
@@ -225,11 +225,7 @@
       </w:pPr>
       <w:r>
         <w:rPr/>
-        <w:t>panel can show results per objects or per check</w:t>
-      </w:r>
-      <w:r>
-        <w:rPr/>
-        <w:t>s</w:t>
+        <w:t>panel can show results per objects or per checks</w:t>
       </w:r>
     </w:p>
     <w:p>
@@ -263,15 +259,7 @@
       </w:pPr>
       <w:r>
         <w:rPr/>
-        <w:t>detailed issue message</w:t>
-      </w:r>
-      <w:r>
-        <w:rPr/>
-        <w:t>s</w:t>
-      </w:r>
-      <w:r>
-        <w:rPr/>
-        <w:t xml:space="preserve"> per failed check</w:t>
+        <w:t>detailed issue messages per failed check</w:t>
       </w:r>
     </w:p>
     <w:p>
@@ -336,39 +324,7 @@
       </w:pPr>
       <w:r>
         <w:rPr/>
-        <w:t xml:space="preserve">What it's for:  Pro </w:t>
-      </w:r>
-      <w:r>
-        <w:rPr/>
-        <w:t>will</w:t>
-      </w:r>
-      <w:r>
-        <w:rPr/>
-        <w:t xml:space="preserve"> essentially </w:t>
-      </w:r>
-      <w:r>
-        <w:rPr/>
-        <w:t xml:space="preserve">be </w:t>
-      </w:r>
-      <w:r>
-        <w:rPr/>
-        <w:t xml:space="preserve">Core version, plus all additional sanity checks Professional Packs </w:t>
-      </w:r>
-      <w:r>
-        <w:rPr/>
-        <w:t>included</w:t>
-      </w:r>
-      <w:r>
-        <w:rPr/>
-        <w:t xml:space="preserve">. It </w:t>
-      </w:r>
-      <w:r>
-        <w:rPr/>
-        <w:t xml:space="preserve">will </w:t>
-      </w:r>
-      <w:r>
-        <w:rPr/>
-        <w:t>also contains additional features, not present in the Core version.</w:t>
+        <w:t>What it's for:  Pro will essentially be Core version, plus all additional sanity checks Professional Packs included. It will also contains additional features, not present in the Core version.</w:t>
       </w:r>
     </w:p>
     <w:p>
@@ -718,21 +674,7 @@
           <w:b w:val="false"/>
           <w:bCs w:val="false"/>
         </w:rPr>
-        <w:t xml:space="preserve"> Additional Professional Packs are individual addon packs Core version owner can add indivually. They are all included with Pro version </w:t>
-      </w:r>
-      <w:r>
-        <w:rPr>
-          <w:b w:val="false"/>
-          <w:bCs w:val="false"/>
-        </w:rPr>
-        <w:t>(consequently, with Studio version)</w:t>
-      </w:r>
-      <w:r>
-        <w:rPr>
-          <w:b w:val="false"/>
-          <w:bCs w:val="false"/>
-        </w:rPr>
-        <w:t>.</w:t>
+        <w:t xml:space="preserve"> Additional Professional Packs are individual addon packs Core version owner can add indivually. They are all included with Pro version (consequently, with Studio version).</w:t>
       </w:r>
     </w:p>
     <w:p>
@@ -793,44 +735,54 @@
     </w:p>
     <w:p>
       <w:pPr>
+        <w:pStyle w:val="Heading2"/>
+        <w:spacing w:before="240" w:after="120"/>
+        <w:rPr>
+          <w:rFonts w:ascii="Calibri" w:hAnsi="Calibri"/>
+        </w:rPr>
+      </w:pPr>
+      <w:r>
+        <w:rPr>
+          <w:rFonts w:ascii="Calibri" w:hAnsi="Calibri"/>
+        </w:rPr>
+        <w:t>Sequencing logic</w:t>
+      </w:r>
+    </w:p>
+    <w:p>
+      <w:pPr>
+        <w:pStyle w:val="Normal"/>
+        <w:spacing w:before="0" w:after="160"/>
+        <w:rPr>
+          <w:rFonts w:ascii="Calibri" w:hAnsi="Calibri"/>
+        </w:rPr>
+      </w:pPr>
+      <w:r>
+        <w:rPr/>
+        <w:t>[Why this order? What does each tier depend on being true/proven first?]</w:t>
+      </w:r>
+    </w:p>
+    <w:p>
+      <w:pPr>
         <w:pStyle w:val="ListParagraph"/>
         <w:numPr>
           <w:ilvl w:val="0"/>
           <w:numId w:val="2"/>
         </w:numPr>
         <w:spacing w:before="0" w:after="80"/>
-        <w:rPr/>
-      </w:pPr>
-      <w:r>
-        <w:rPr/>
-      </w:r>
-    </w:p>
-    <w:p>
-      <w:pPr>
-        <w:pStyle w:val="Heading2"/>
-        <w:spacing w:before="240" w:after="120"/>
-        <w:rPr>
-          <w:rFonts w:ascii="Calibri" w:hAnsi="Calibri"/>
-        </w:rPr>
-      </w:pPr>
-      <w:r>
-        <w:rPr>
-          <w:rFonts w:ascii="Calibri" w:hAnsi="Calibri"/>
-        </w:rPr>
-        <w:t>Sequencing logic</w:t>
-      </w:r>
-    </w:p>
-    <w:p>
-      <w:pPr>
-        <w:pStyle w:val="Normal"/>
-        <w:spacing w:before="0" w:after="160"/>
-        <w:rPr>
-          <w:rFonts w:ascii="Calibri" w:hAnsi="Calibri"/>
-        </w:rPr>
-      </w:pPr>
-      <w:r>
-        <w:rPr/>
-        <w:t>[Why this order? What does each tier depend on being true/proven first?]</w:t>
+        <w:rPr>
+          <w:rFonts w:ascii="Calibri" w:hAnsi="Calibri"/>
+        </w:rPr>
+      </w:pPr>
+      <w:r>
+        <w:rPr>
+          <w:b/>
+          <w:bCs/>
+        </w:rPr>
+        <w:t>Core</w:t>
+      </w:r>
+      <w:r>
+        <w:rPr/>
+        <w:t xml:space="preserve"> is the main panel and functions</w:t>
       </w:r>
     </w:p>
     <w:p>
@@ -846,8 +798,15 @@
         </w:rPr>
       </w:pPr>
       <w:r>
-        <w:rPr/>
-        <w:t>Core is the main panel and functions</w:t>
+        <w:rPr>
+          <w:b/>
+          <w:bCs/>
+        </w:rPr>
+        <w:t>Pro</w:t>
+      </w:r>
+      <w:r>
+        <w:rPr/>
+        <w:t xml:space="preserve"> is Core with additional features (sold with the additional packs)</w:t>
       </w:r>
     </w:p>
     <w:p>
@@ -863,8 +822,55 @@
         </w:rPr>
       </w:pPr>
       <w:r>
-        <w:rPr/>
-        <w:t>Pro is Core with additional features (sold with the additinal packs)</w:t>
+        <w:rPr>
+          <w:b/>
+          <w:bCs/>
+        </w:rPr>
+        <w:t>Studio</w:t>
+      </w:r>
+      <w:r>
+        <w:rPr/>
+        <w:t xml:space="preserve"> is Pro plus possible customization</w:t>
+      </w:r>
+    </w:p>
+    <w:p>
+      <w:pPr>
+        <w:pStyle w:val="ListParagraph"/>
+        <w:spacing w:before="0" w:after="80"/>
+        <w:rPr>
+          <w:rFonts w:ascii="Calibri" w:hAnsi="Calibri"/>
+        </w:rPr>
+      </w:pPr>
+      <w:r>
+        <w:rPr/>
+      </w:r>
+    </w:p>
+    <w:p>
+      <w:pPr>
+        <w:pStyle w:val="Heading2"/>
+        <w:spacing w:before="240" w:after="120"/>
+        <w:rPr>
+          <w:rFonts w:ascii="Calibri" w:hAnsi="Calibri"/>
+        </w:rPr>
+      </w:pPr>
+      <w:r>
+        <w:rPr>
+          <w:rFonts w:ascii="Calibri" w:hAnsi="Calibri"/>
+        </w:rPr>
+        <w:t>Open questions</w:t>
+      </w:r>
+    </w:p>
+    <w:p>
+      <w:pPr>
+        <w:pStyle w:val="Normal"/>
+        <w:spacing w:before="0" w:after="160"/>
+        <w:rPr>
+          <w:rFonts w:ascii="Calibri" w:hAnsi="Calibri"/>
+        </w:rPr>
+      </w:pPr>
+      <w:r>
+        <w:rPr/>
+        <w:t>Things we know we haven't decided yet — not a to-do list, just a parking lot.</w:t>
       </w:r>
     </w:p>
     <w:p>
@@ -881,55 +887,7 @@
       </w:pPr>
       <w:r>
         <w:rPr/>
-        <w:t xml:space="preserve">Studio is Pro plus </w:t>
-      </w:r>
-      <w:r>
-        <w:rPr/>
-        <w:t xml:space="preserve">possible </w:t>
-      </w:r>
-      <w:r>
-        <w:rPr/>
-        <w:t>customization</w:t>
-      </w:r>
-    </w:p>
-    <w:p>
-      <w:pPr>
-        <w:pStyle w:val="ListParagraph"/>
-        <w:spacing w:before="0" w:after="80"/>
-        <w:rPr>
-          <w:rFonts w:ascii="Calibri" w:hAnsi="Calibri"/>
-        </w:rPr>
-      </w:pPr>
-      <w:r>
-        <w:rPr/>
-      </w:r>
-    </w:p>
-    <w:p>
-      <w:pPr>
-        <w:pStyle w:val="Heading2"/>
-        <w:spacing w:before="240" w:after="120"/>
-        <w:rPr>
-          <w:rFonts w:ascii="Calibri" w:hAnsi="Calibri"/>
-        </w:rPr>
-      </w:pPr>
-      <w:r>
-        <w:rPr>
-          <w:rFonts w:ascii="Calibri" w:hAnsi="Calibri"/>
-        </w:rPr>
-        <w:t>Open questions</w:t>
-      </w:r>
-    </w:p>
-    <w:p>
-      <w:pPr>
-        <w:pStyle w:val="Normal"/>
-        <w:spacing w:before="0" w:after="160"/>
-        <w:rPr>
-          <w:rFonts w:ascii="Calibri" w:hAnsi="Calibri"/>
-        </w:rPr>
-      </w:pPr>
-      <w:r>
-        <w:rPr/>
-        <w:t>Things we know we haven't decided yet — not a to-do list, just a parking lot.</w:t>
+        <w:t>Where exactly does the Core/Pro feature boundary sit?</w:t>
       </w:r>
     </w:p>
     <w:p>
@@ -946,40 +904,11 @@
       </w:pPr>
       <w:r>
         <w:rPr/>
-        <w:t>Where exactly does the Core/Pro feature boundary sit?</w:t>
-      </w:r>
-    </w:p>
-    <w:p>
-      <w:pPr>
-        <w:pStyle w:val="ListParagraph"/>
-        <w:numPr>
-          <w:ilvl w:val="0"/>
-          <w:numId w:val="2"/>
-        </w:numPr>
-        <w:spacing w:before="0" w:after="80"/>
-        <w:rPr>
-          <w:rFonts w:ascii="Calibri" w:hAnsi="Calibri"/>
-        </w:rPr>
-      </w:pPr>
-      <w:r>
-        <w:rPr/>
-        <w:t>Pricing per tier?</w:t>
-      </w:r>
-    </w:p>
-    <w:p>
-      <w:pPr>
-        <w:pStyle w:val="ListParagraph"/>
-        <w:numPr>
-          <w:ilvl w:val="0"/>
-          <w:numId w:val="2"/>
-        </w:numPr>
-        <w:spacing w:before="0" w:after="80"/>
-        <w:rPr>
-          <w:rFonts w:ascii="Calibri" w:hAnsi="Calibri"/>
-        </w:rPr>
-      </w:pPr>
-      <w:r>
-        <w:rPr/>
+        <w:t xml:space="preserve">Pricing per tier? </w:t>
+      </w:r>
+      <w:r>
+        <w:rPr/>
+        <w:t>20, 35, 50 (+15)</w:t>
       </w:r>
     </w:p>
     <w:p>
@@ -1084,8 +1013,8 @@
         </w:tblCellMar>
       </w:tblPr>
       <w:tblGrid>
-        <w:gridCol w:w="1619"/>
-        <w:gridCol w:w="2386"/>
+        <w:gridCol w:w="1618"/>
+        <w:gridCol w:w="2387"/>
         <w:gridCol w:w="2490"/>
         <w:gridCol w:w="3510"/>
       </w:tblGrid>
@@ -1095,7 +1024,7 @@
         </w:trPr>
         <w:tc>
           <w:tcPr>
-            <w:tcW w:w="1619" w:type="dxa"/>
+            <w:tcW w:w="1618" w:type="dxa"/>
             <w:tcBorders/>
             <w:vAlign w:val="center"/>
           </w:tcPr>
@@ -1118,7 +1047,7 @@
         </w:tc>
         <w:tc>
           <w:tcPr>
-            <w:tcW w:w="2386" w:type="dxa"/>
+            <w:tcW w:w="2387" w:type="dxa"/>
             <w:tcBorders/>
             <w:vAlign w:val="center"/>
           </w:tcPr>
@@ -1180,7 +1109,7 @@
         </w:trPr>
         <w:tc>
           <w:tcPr>
-            <w:tcW w:w="1619" w:type="dxa"/>
+            <w:tcW w:w="1618" w:type="dxa"/>
             <w:tcBorders/>
             <w:vAlign w:val="center"/>
           </w:tcPr>
@@ -1204,7 +1133,7 @@
         </w:tc>
         <w:tc>
           <w:tcPr>
-            <w:tcW w:w="2386" w:type="dxa"/>
+            <w:tcW w:w="2387" w:type="dxa"/>
             <w:tcBorders/>
             <w:vAlign w:val="center"/>
           </w:tcPr>
@@ -1281,7 +1210,7 @@
         </w:trPr>
         <w:tc>
           <w:tcPr>
-            <w:tcW w:w="1619" w:type="dxa"/>
+            <w:tcW w:w="1618" w:type="dxa"/>
             <w:tcBorders/>
             <w:vAlign w:val="center"/>
           </w:tcPr>
@@ -1305,7 +1234,7 @@
         </w:tc>
         <w:tc>
           <w:tcPr>
-            <w:tcW w:w="2386" w:type="dxa"/>
+            <w:tcW w:w="2387" w:type="dxa"/>
             <w:tcBorders/>
             <w:vAlign w:val="center"/>
           </w:tcPr>
@@ -1382,7 +1311,7 @@
         </w:trPr>
         <w:tc>
           <w:tcPr>
-            <w:tcW w:w="1619" w:type="dxa"/>
+            <w:tcW w:w="1618" w:type="dxa"/>
             <w:tcBorders/>
             <w:vAlign w:val="center"/>
           </w:tcPr>
@@ -1406,7 +1335,7 @@
         </w:tc>
         <w:tc>
           <w:tcPr>
-            <w:tcW w:w="2386" w:type="dxa"/>
+            <w:tcW w:w="2387" w:type="dxa"/>
             <w:tcBorders/>
             <w:vAlign w:val="center"/>
           </w:tcPr>
@@ -1483,7 +1412,7 @@
         </w:trPr>
         <w:tc>
           <w:tcPr>
-            <w:tcW w:w="1619" w:type="dxa"/>
+            <w:tcW w:w="1618" w:type="dxa"/>
             <w:tcBorders/>
             <w:vAlign w:val="center"/>
           </w:tcPr>
@@ -1507,7 +1436,7 @@
         </w:tc>
         <w:tc>
           <w:tcPr>
-            <w:tcW w:w="2386" w:type="dxa"/>
+            <w:tcW w:w="2387" w:type="dxa"/>
             <w:tcBorders/>
             <w:vAlign w:val="center"/>
           </w:tcPr>
@@ -1582,7 +1511,7 @@
         <w:trPr/>
         <w:tc>
           <w:tcPr>
-            <w:tcW w:w="1619" w:type="dxa"/>
+            <w:tcW w:w="1618" w:type="dxa"/>
             <w:tcBorders/>
             <w:vAlign w:val="center"/>
           </w:tcPr>
@@ -1606,7 +1535,7 @@
         </w:tc>
         <w:tc>
           <w:tcPr>
-            <w:tcW w:w="2386" w:type="dxa"/>
+            <w:tcW w:w="2387" w:type="dxa"/>
             <w:tcBorders/>
             <w:vAlign w:val="center"/>
           </w:tcPr>
@@ -2235,8 +2164,8 @@
       <w:u w:val="single"/>
     </w:rPr>
   </w:style>
-  <w:style w:type="character" w:styleId="FootnoteCharactersuser">
-    <w:name w:val="Footnote Characters (user)"/>
+  <w:style w:type="character" w:styleId="FootnoteCharacters">
+    <w:name w:val="Footnote Characters"/>
     <w:uiPriority w:val="99"/>
     <w:semiHidden/>
     <w:unhideWhenUsed/>
@@ -2245,8 +2174,8 @@
       <w:vertAlign w:val="superscript"/>
     </w:rPr>
   </w:style>
-  <w:style w:type="character" w:styleId="FootnoteCharacters">
-    <w:name w:val="Footnote Characters"/>
+  <w:style w:type="character" w:styleId="FootnoteCharactersuser">
+    <w:name w:val="Footnote Characters (user)"/>
     <w:qFormat/>
     <w:rPr>
       <w:vertAlign w:val="superscript"/>
@@ -2270,8 +2199,8 @@
       <w:szCs w:val="20"/>
     </w:rPr>
   </w:style>
-  <w:style w:type="character" w:styleId="EndnoteCharactersuser">
-    <w:name w:val="Endnote Characters (user)"/>
+  <w:style w:type="character" w:styleId="EndnoteCharacters">
+    <w:name w:val="Endnote Characters"/>
     <w:uiPriority w:val="99"/>
     <w:semiHidden/>
     <w:unhideWhenUsed/>
@@ -2280,8 +2209,8 @@
       <w:vertAlign w:val="superscript"/>
     </w:rPr>
   </w:style>
-  <w:style w:type="character" w:styleId="EndnoteCharacters">
-    <w:name w:val="Endnote Characters"/>
+  <w:style w:type="character" w:styleId="EndnoteCharactersuser">
+    <w:name w:val="Endnote Characters (user)"/>
     <w:qFormat/>
     <w:rPr>
       <w:vertAlign w:val="superscript"/>

</xml_diff>